<commit_message>
add layout overrides for Hugo 0.161+ compatibility with Congo
Co-Authored-By: Claude Opus 4.6 <noreply@anthropic.com>
</commit_message>
<xml_diff>
--- a/public/resume.docx
+++ b/public/resume.docx
@@ -147,7 +147,7 @@
           <w:color w:val="auto"/>
           <w:sz w:val="32"/>
         </w:rPr>
-        <w:t>Maharashtra</w:t>
+        <w:t>Maharastra</w:t>
       </w:r>
       <w:r>
         <w:rPr>
@@ -219,25 +219,14 @@
           <w:color w:val="auto"/>
         </w:rPr>
       </w:pPr>
-      <w:proofErr w:type="spellStart"/>
-      <w:r>
-        <w:rPr>
-          <w:rFonts w:ascii="Garamond" w:hAnsi="Garamond"/>
-          <w:b/>
-          <w:bCs/>
-          <w:color w:val="auto"/>
-        </w:rPr>
-        <w:t>Alumn-ait</w:t>
-      </w:r>
-      <w:proofErr w:type="spellEnd"/>
-      <w:r>
-        <w:rPr>
-          <w:rFonts w:ascii="Garamond" w:hAnsi="Garamond"/>
-          <w:b/>
-          <w:bCs/>
-          <w:color w:val="auto"/>
-        </w:rPr>
-        <w:t xml:space="preserve"> </w:t>
+      <w:r>
+        <w:rPr>
+          <w:rFonts w:ascii="Garamond" w:hAnsi="Garamond"/>
+          <w:b/>
+          <w:bCs/>
+          <w:color w:val="auto"/>
+        </w:rPr>
+        <w:t xml:space="preserve">Alumn-ait </w:t>
       </w:r>
       <w:r>
         <w:rPr>
@@ -251,39 +240,7 @@
           <w:rFonts w:ascii="Garamond" w:hAnsi="Garamond"/>
           <w:color w:val="auto"/>
         </w:rPr>
-        <w:t xml:space="preserve">eb application made for the alumnus of the college to connect with college and post relevant information. Created using </w:t>
-      </w:r>
-      <w:proofErr w:type="spellStart"/>
-      <w:r>
-        <w:rPr>
-          <w:rFonts w:ascii="Garamond" w:hAnsi="Garamond"/>
-          <w:color w:val="auto"/>
-        </w:rPr>
-        <w:t>NextJs</w:t>
-      </w:r>
-      <w:proofErr w:type="spellEnd"/>
-      <w:r>
-        <w:rPr>
-          <w:rFonts w:ascii="Garamond" w:hAnsi="Garamond"/>
-          <w:color w:val="auto"/>
-        </w:rPr>
-        <w:t xml:space="preserve"> and </w:t>
-      </w:r>
-      <w:proofErr w:type="spellStart"/>
-      <w:r>
-        <w:rPr>
-          <w:rFonts w:ascii="Garamond" w:hAnsi="Garamond"/>
-          <w:color w:val="auto"/>
-        </w:rPr>
-        <w:t>postgresql</w:t>
-      </w:r>
-      <w:proofErr w:type="spellEnd"/>
-      <w:r>
-        <w:rPr>
-          <w:rFonts w:ascii="Garamond" w:hAnsi="Garamond"/>
-          <w:color w:val="auto"/>
-        </w:rPr>
-        <w:t xml:space="preserve"> as database.</w:t>
+        <w:t>eb application made for the alumnus of the college to connect with college and post relevant information. Created using NextJs and postgresql as database.</w:t>
       </w:r>
     </w:p>
     <w:p>
@@ -327,23 +284,7 @@
           <w:rFonts w:ascii="Garamond" w:hAnsi="Garamond"/>
           <w:color w:val="auto"/>
         </w:rPr>
-        <w:t xml:space="preserve"> web application using Next.js that converts org-roam notes into web pages with a visually appealing structure using </w:t>
-      </w:r>
-      <w:proofErr w:type="spellStart"/>
-      <w:r>
-        <w:rPr>
-          <w:rFonts w:ascii="Garamond" w:hAnsi="Garamond"/>
-          <w:color w:val="auto"/>
-        </w:rPr>
-        <w:t>UniOrg</w:t>
-      </w:r>
-      <w:proofErr w:type="spellEnd"/>
-      <w:r>
-        <w:rPr>
-          <w:rFonts w:ascii="Garamond" w:hAnsi="Garamond"/>
-          <w:color w:val="auto"/>
-        </w:rPr>
-        <w:t xml:space="preserve"> engine.</w:t>
+        <w:t xml:space="preserve"> web application using Next.js that converts org-roam notes into web pages with a visually appealing structure using UniOrg engine.</w:t>
       </w:r>
     </w:p>
     <w:p>
@@ -393,27 +334,7 @@
           <w:color w:val="000000" w:themeColor="text1"/>
           <w:u w:val="none"/>
         </w:rPr>
-        <w:t xml:space="preserve">Developed a Personal Website using the Hugo and </w:t>
-      </w:r>
-      <w:proofErr w:type="spellStart"/>
-      <w:r>
-        <w:rPr>
-          <w:rStyle w:val="Hyperlink"/>
-          <w:rFonts w:ascii="Garamond" w:hAnsi="Garamond"/>
-          <w:color w:val="000000" w:themeColor="text1"/>
-          <w:u w:val="none"/>
-        </w:rPr>
-        <w:t>TailwindCSS</w:t>
-      </w:r>
-      <w:proofErr w:type="spellEnd"/>
-      <w:r>
-        <w:rPr>
-          <w:rStyle w:val="Hyperlink"/>
-          <w:rFonts w:ascii="Garamond" w:hAnsi="Garamond"/>
-          <w:color w:val="000000" w:themeColor="text1"/>
-          <w:u w:val="none"/>
-        </w:rPr>
-        <w:t xml:space="preserve"> for styling. </w:t>
+        <w:t xml:space="preserve">Developed a Personal Website using the Hugo and TailwindCSS for styling. </w:t>
       </w:r>
     </w:p>
     <w:p>
@@ -439,21 +360,12 @@
         </w:rPr>
         <w:t xml:space="preserve">Notes-Taker </w:t>
       </w:r>
-      <w:proofErr w:type="spellStart"/>
-      <w:r>
-        <w:rPr>
-          <w:rFonts w:ascii="Garamond" w:hAnsi="Garamond"/>
-          <w:color w:val="auto"/>
-        </w:rPr>
-        <w:t>Notes-Taker</w:t>
-      </w:r>
-      <w:proofErr w:type="spellEnd"/>
-      <w:r>
-        <w:rPr>
-          <w:rFonts w:ascii="Garamond" w:hAnsi="Garamond"/>
-          <w:color w:val="auto"/>
-        </w:rPr>
-        <w:t xml:space="preserve"> is a full-stack note-taking application with a Django-based backend and a React frontend that communicates using REST APIs.</w:t>
+      <w:r>
+        <w:rPr>
+          <w:rFonts w:ascii="Garamond" w:hAnsi="Garamond"/>
+          <w:color w:val="auto"/>
+        </w:rPr>
+        <w:t>Notes-Taker is a full-stack note-taking application with a Django-based backend and a React frontend that communicates using REST APIs.</w:t>
       </w:r>
     </w:p>
     <w:p>
@@ -480,21 +392,12 @@
         </w:rPr>
         <w:t xml:space="preserve">Django-Store </w:t>
       </w:r>
-      <w:proofErr w:type="spellStart"/>
-      <w:r>
-        <w:rPr>
-          <w:rFonts w:ascii="Garamond" w:hAnsi="Garamond"/>
-          <w:color w:val="auto"/>
-        </w:rPr>
-        <w:t>Django-Store</w:t>
-      </w:r>
-      <w:proofErr w:type="spellEnd"/>
-      <w:r>
-        <w:rPr>
-          <w:rFonts w:ascii="Garamond" w:hAnsi="Garamond"/>
-          <w:color w:val="auto"/>
-        </w:rPr>
-        <w:t xml:space="preserve"> is a full-stack e-commerce web application developed using the Django framework and utilizing PostgreSQL as the database management system.</w:t>
+      <w:r>
+        <w:rPr>
+          <w:rFonts w:ascii="Garamond" w:hAnsi="Garamond"/>
+          <w:color w:val="auto"/>
+        </w:rPr>
+        <w:t>Django-Store is a full-stack e-commerce web application developed using the Django framework and utilizing PostgreSQL as the database management system.</w:t>
       </w:r>
     </w:p>
     <w:p>
@@ -552,7 +455,6 @@
           <w:color w:val="auto"/>
         </w:rPr>
       </w:pPr>
-      <w:proofErr w:type="spellStart"/>
       <w:r>
         <w:rPr>
           <w:rFonts w:ascii="Garamond" w:hAnsi="Garamond"/>
@@ -562,7 +464,6 @@
         </w:rPr>
         <w:t>Deverse</w:t>
       </w:r>
-      <w:proofErr w:type="spellEnd"/>
       <w:r>
         <w:rPr>
           <w:rFonts w:ascii="Garamond" w:hAnsi="Garamond"/>
@@ -572,44 +473,19 @@
         </w:rPr>
         <w:t xml:space="preserve"> </w:t>
       </w:r>
-      <w:proofErr w:type="gramStart"/>
-      <w:r>
-        <w:rPr>
-          <w:rFonts w:ascii="Garamond" w:hAnsi="Garamond"/>
-          <w:color w:val="auto"/>
-        </w:rPr>
-        <w:t>selected</w:t>
-      </w:r>
-      <w:proofErr w:type="gramEnd"/>
-      <w:r>
-        <w:rPr>
-          <w:rFonts w:ascii="Garamond" w:hAnsi="Garamond"/>
-          <w:color w:val="auto"/>
-        </w:rPr>
-        <w:t xml:space="preserve"> as part of the top 5 teams, showcasing strong technical and teamwork skills</w:t>
-      </w:r>
-      <w:r>
-        <w:rPr>
-          <w:rFonts w:ascii="Garamond" w:hAnsi="Garamond"/>
-          <w:color w:val="auto"/>
-        </w:rPr>
-        <w:t xml:space="preserve">. Project employed </w:t>
-      </w:r>
-      <w:proofErr w:type="spellStart"/>
-      <w:r>
-        <w:rPr>
-          <w:rFonts w:ascii="Garamond" w:hAnsi="Garamond"/>
-          <w:color w:val="auto"/>
-        </w:rPr>
-        <w:t>NextJs</w:t>
-      </w:r>
-      <w:proofErr w:type="spellEnd"/>
-      <w:r>
-        <w:rPr>
-          <w:rFonts w:ascii="Garamond" w:hAnsi="Garamond"/>
-          <w:color w:val="auto"/>
-        </w:rPr>
-        <w:t>.</w:t>
+      <w:r>
+        <w:rPr>
+          <w:rFonts w:ascii="Garamond" w:hAnsi="Garamond"/>
+          <w:color w:val="auto"/>
+        </w:rPr>
+        <w:t>selected as part of the top 5 teams, showcasing strong technical and teamwork skills</w:t>
+      </w:r>
+      <w:r>
+        <w:rPr>
+          <w:rFonts w:ascii="Garamond" w:hAnsi="Garamond"/>
+          <w:color w:val="auto"/>
+        </w:rPr>
+        <w:t>. Project employed NextJs.</w:t>
       </w:r>
     </w:p>
     <w:p>
@@ -640,23 +516,7 @@
           <w:rFonts w:ascii="Garamond" w:hAnsi="Garamond"/>
           <w:color w:val="auto"/>
         </w:rPr>
-        <w:t xml:space="preserve">Selected to represent Army Institute </w:t>
-      </w:r>
-      <w:proofErr w:type="gramStart"/>
-      <w:r>
-        <w:rPr>
-          <w:rFonts w:ascii="Garamond" w:hAnsi="Garamond"/>
-          <w:color w:val="auto"/>
-        </w:rPr>
-        <w:t>Of</w:t>
-      </w:r>
-      <w:proofErr w:type="gramEnd"/>
-      <w:r>
-        <w:rPr>
-          <w:rFonts w:ascii="Garamond" w:hAnsi="Garamond"/>
-          <w:color w:val="auto"/>
-        </w:rPr>
-        <w:t xml:space="preserve"> Technology, Pune</w:t>
+        <w:t>Selected to represent Army Institute Of Technology, Pune</w:t>
       </w:r>
       <w:r>
         <w:rPr>
@@ -687,7 +547,6 @@
           <w:color w:val="auto"/>
         </w:rPr>
       </w:pPr>
-      <w:proofErr w:type="spellStart"/>
       <w:r>
         <w:rPr>
           <w:rFonts w:ascii="Garamond" w:hAnsi="Garamond"/>
@@ -704,65 +563,14 @@
           <w:bCs/>
           <w:color w:val="auto"/>
         </w:rPr>
-        <w:t>aphica</w:t>
-      </w:r>
-      <w:proofErr w:type="spellEnd"/>
-      <w:r>
-        <w:rPr>
-          <w:rFonts w:ascii="Garamond" w:hAnsi="Garamond"/>
-          <w:b/>
-          <w:bCs/>
-          <w:color w:val="auto"/>
-        </w:rPr>
-        <w:t xml:space="preserve"> </w:t>
-      </w:r>
-      <w:r>
-        <w:rPr>
-          <w:rFonts w:ascii="Garamond" w:hAnsi="Garamond"/>
-          <w:color w:val="auto"/>
-        </w:rPr>
-        <w:t xml:space="preserve">Won 3rd position in </w:t>
-      </w:r>
-      <w:proofErr w:type="spellStart"/>
-      <w:proofErr w:type="gramStart"/>
-      <w:r>
-        <w:rPr>
-          <w:rFonts w:ascii="Garamond" w:hAnsi="Garamond"/>
-          <w:color w:val="auto"/>
-        </w:rPr>
-        <w:t>Graphica</w:t>
-      </w:r>
-      <w:proofErr w:type="spellEnd"/>
-      <w:r>
-        <w:rPr>
-          <w:rFonts w:ascii="Garamond" w:hAnsi="Garamond"/>
-          <w:color w:val="auto"/>
-        </w:rPr>
-        <w:t>(</w:t>
-      </w:r>
-      <w:proofErr w:type="gramEnd"/>
-      <w:r>
-        <w:rPr>
-          <w:rFonts w:ascii="Garamond" w:hAnsi="Garamond"/>
-          <w:color w:val="auto"/>
-        </w:rPr>
-        <w:t xml:space="preserve">2021), </w:t>
-      </w:r>
-      <w:proofErr w:type="spellStart"/>
-      <w:r>
-        <w:rPr>
-          <w:rFonts w:ascii="Garamond" w:hAnsi="Garamond"/>
-          <w:color w:val="auto"/>
-        </w:rPr>
-        <w:t>a</w:t>
-      </w:r>
-      <w:proofErr w:type="spellEnd"/>
-      <w:r>
-        <w:rPr>
-          <w:rFonts w:ascii="Garamond" w:hAnsi="Garamond"/>
-          <w:color w:val="auto"/>
-        </w:rPr>
-        <w:t xml:space="preserve"> inter-college front-end development event held by OSS-Club, AIT. Acted as lead programmer.</w:t>
+        <w:t xml:space="preserve">aphica </w:t>
+      </w:r>
+      <w:r>
+        <w:rPr>
+          <w:rFonts w:ascii="Garamond" w:hAnsi="Garamond"/>
+          <w:color w:val="auto"/>
+        </w:rPr>
+        <w:t>Won 3rd position in Graphica(2021), a inter-college front-end development event held by OSS-Club, AIT. Acted as lead programmer.</w:t>
       </w:r>
     </w:p>
     <w:p>
@@ -862,27 +670,7 @@
           <w:iCs/>
           <w:color w:val="auto"/>
         </w:rPr>
-        <w:t xml:space="preserve">Granted </w:t>
-      </w:r>
-      <w:proofErr w:type="gramStart"/>
-      <w:r>
-        <w:rPr>
-          <w:rFonts w:ascii="Garamond" w:hAnsi="Garamond"/>
-          <w:i/>
-          <w:iCs/>
-          <w:color w:val="auto"/>
-        </w:rPr>
-        <w:t>on the basis of</w:t>
-      </w:r>
-      <w:proofErr w:type="gramEnd"/>
-      <w:r>
-        <w:rPr>
-          <w:rFonts w:ascii="Garamond" w:hAnsi="Garamond"/>
-          <w:i/>
-          <w:iCs/>
-          <w:color w:val="auto"/>
-        </w:rPr>
-        <w:t xml:space="preserve"> academic performance and </w:t>
+        <w:t xml:space="preserve">Granted on the basis of academic performance and </w:t>
       </w:r>
       <w:r>
         <w:rPr>
@@ -1013,47 +801,7 @@
           <w:i/>
           <w:color w:val="auto"/>
         </w:rPr>
-        <w:t xml:space="preserve">of the academic year in RED School, </w:t>
-      </w:r>
-      <w:proofErr w:type="spellStart"/>
-      <w:r>
-        <w:rPr>
-          <w:rFonts w:ascii="Garamond" w:hAnsi="Garamond"/>
-          <w:bCs/>
-          <w:i/>
-          <w:color w:val="auto"/>
-        </w:rPr>
-        <w:t>Charkhi</w:t>
-      </w:r>
-      <w:proofErr w:type="spellEnd"/>
-      <w:r>
-        <w:rPr>
-          <w:rFonts w:ascii="Garamond" w:hAnsi="Garamond"/>
-          <w:bCs/>
-          <w:i/>
-          <w:color w:val="auto"/>
-        </w:rPr>
-        <w:t xml:space="preserve"> Dadri. Got 50% concession 2 consecutive </w:t>
-      </w:r>
-      <w:proofErr w:type="gramStart"/>
-      <w:r>
-        <w:rPr>
-          <w:rFonts w:ascii="Garamond" w:hAnsi="Garamond"/>
-          <w:bCs/>
-          <w:i/>
-          <w:color w:val="auto"/>
-        </w:rPr>
-        <w:t>years(</w:t>
-      </w:r>
-      <w:proofErr w:type="gramEnd"/>
-      <w:r>
-        <w:rPr>
-          <w:rFonts w:ascii="Garamond" w:hAnsi="Garamond"/>
-          <w:bCs/>
-          <w:i/>
-          <w:color w:val="auto"/>
-        </w:rPr>
-        <w:t>11-12</w:t>
+        <w:t>of the academic year in RED School, Charkhi Dadri. Got 50% concession 2 consecutive years(11-12</w:t>
       </w:r>
       <w:r>
         <w:rPr>
@@ -1242,36 +990,16 @@
           <w:bCs/>
           <w:color w:val="auto"/>
         </w:rPr>
-        <w:t xml:space="preserve">                         </w:t>
-      </w:r>
-      <w:proofErr w:type="gramStart"/>
-      <w:r>
-        <w:rPr>
-          <w:rFonts w:ascii="Garamond" w:hAnsi="Garamond"/>
-          <w:b/>
-          <w:bCs/>
-          <w:color w:val="auto"/>
-        </w:rPr>
-        <w:t>July</w:t>
-      </w:r>
-      <w:r>
-        <w:rPr>
-          <w:rFonts w:ascii="Garamond" w:hAnsi="Garamond"/>
-          <w:b/>
-          <w:bCs/>
-          <w:color w:val="auto"/>
-        </w:rPr>
-        <w:t>,</w:t>
-      </w:r>
-      <w:proofErr w:type="gramEnd"/>
-      <w:r>
-        <w:rPr>
-          <w:rFonts w:ascii="Garamond" w:hAnsi="Garamond"/>
-          <w:b/>
-          <w:bCs/>
-          <w:color w:val="auto"/>
-        </w:rPr>
-        <w:t xml:space="preserve"> </w:t>
+        <w:t xml:space="preserve">                         July</w:t>
+      </w:r>
+      <w:r>
+        <w:rPr>
+          <w:rFonts w:ascii="Garamond" w:hAnsi="Garamond"/>
+          <w:b/>
+          <w:bCs/>
+          <w:color w:val="auto"/>
+        </w:rPr>
+        <w:t xml:space="preserve">, </w:t>
       </w:r>
       <w:r>
         <w:rPr>
@@ -1490,27 +1218,7 @@
           <w:iCs/>
           <w:color w:val="auto"/>
         </w:rPr>
-        <w:t xml:space="preserve">ReactJS, </w:t>
-      </w:r>
-      <w:proofErr w:type="spellStart"/>
-      <w:r>
-        <w:rPr>
-          <w:rFonts w:ascii="Garamond" w:hAnsi="Garamond"/>
-          <w:i/>
-          <w:iCs/>
-          <w:color w:val="auto"/>
-        </w:rPr>
-        <w:t>NextJS</w:t>
-      </w:r>
-      <w:proofErr w:type="spellEnd"/>
-      <w:r>
-        <w:rPr>
-          <w:rFonts w:ascii="Garamond" w:hAnsi="Garamond"/>
-          <w:i/>
-          <w:iCs/>
-          <w:color w:val="auto"/>
-        </w:rPr>
-        <w:t xml:space="preserve">, </w:t>
+        <w:t xml:space="preserve">ReactJS, NextJS, </w:t>
       </w:r>
       <w:r>
         <w:rPr>

</xml_diff>